<commit_message>
chore(ops): Pilot KPI seed·E2E Docker·PRD S-10 — v1.3.4
Co-authored-by: Cursor <cursoragent@cursor.com>
</commit_message>
<xml_diff>
--- a/docs/Ten_Eyes_Intranet_Part1_PRD_v1.2.1_Final.docx
+++ b/docs/Ten_Eyes_Intranet_Part1_PRD_v1.2.1_Final.docx
@@ -2865,6 +2865,22 @@
           <w:color w:val="334155"/>
           <w:sz w:val="21"/>
         </w:rPr>
+        <w:t>ADMIN: Pilot KPI (7일) 스트립 — PRD KPI 6종 실측(§3 KPI 표)</w:t>
+      </w:r>
+    </w:p>
+    <w:p>
+      <w:pPr>
+        <w:pStyle w:val="ListBullet"/>
+        <w:spacing w:after="60" w:line="264" w:lineRule="auto"/>
+        <w:ind w:left="227"/>
+      </w:pPr>
+      <w:r>
+        <w:rPr>
+          <w:rFonts w:ascii="맑은 고딕" w:hAnsi="맑은 고딕" w:eastAsia="맑은 고딕"/>
+          <w:b w:val="0"/>
+          <w:color w:val="334155"/>
+          <w:sz w:val="21"/>
+        </w:rPr>
         <w:t>최근 게시글·AI 요약·기능 바로가기 위젯</w:t>
       </w:r>
     </w:p>
@@ -3984,6 +4000,212 @@
           <w:sz w:val="18"/>
         </w:rPr>
         <w:t>[ 이미지 삽입 영역 — S-09 ]</w:t>
+        <w:br/>
+        <w:t>권장: 1920×1080 또는 모바일 390×844 · PNG · 개인정보·데모 비밀번호 마스킹</w:t>
+      </w:r>
+    </w:p>
+    <w:p>
+      <w:pPr>
+        <w:pStyle w:val="Heading2"/>
+        <w:spacing w:before="200" w:after="160"/>
+      </w:pPr>
+      <w:r>
+        <w:rPr>
+          <w:rFonts w:ascii="맑은 고딕" w:hAnsi="맑은 고딕" w:eastAsia="맑은 고딕"/>
+          <w:b/>
+          <w:color w:val="0F172A"/>
+          <w:sz w:val="26"/>
+        </w:rPr>
+        <w:t>4.9 Pilot KPI (ADMIN)</w:t>
+      </w:r>
+    </w:p>
+    <w:p>
+      <w:pPr>
+        <w:pStyle w:val="ListBullet"/>
+        <w:spacing w:after="60" w:line="264" w:lineRule="auto"/>
+        <w:ind w:left="227"/>
+      </w:pPr>
+      <w:r>
+        <w:rPr>
+          <w:rFonts w:ascii="맑은 고딕" w:hAnsi="맑은 고딕" w:eastAsia="맑은 고딕"/>
+          <w:b w:val="0"/>
+          <w:color w:val="334155"/>
+          <w:sz w:val="21"/>
+        </w:rPr>
+        <w:t>PRD §3 KPI 6종 — 주간 활성 대리점·공지 도달·Page Builder 자립도·AI·장애·교육</w:t>
+      </w:r>
+    </w:p>
+    <w:p>
+      <w:pPr>
+        <w:pStyle w:val="ListBullet"/>
+        <w:spacing w:after="60" w:line="264" w:lineRule="auto"/>
+        <w:ind w:left="227"/>
+      </w:pPr>
+      <w:r>
+        <w:rPr>
+          <w:rFonts w:ascii="맑은 고딕" w:hAnsi="맑은 고딕" w:eastAsia="맑은 고딕"/>
+          <w:b w:val="0"/>
+          <w:color w:val="334155"/>
+          <w:sz w:val="21"/>
+        </w:rPr>
+        <w:t>데이터: AuditLog · UsageMetric · SystemErrorLog · 공지 viewCount (7일)</w:t>
+      </w:r>
+    </w:p>
+    <w:p>
+      <w:pPr>
+        <w:pStyle w:val="ListBullet"/>
+        <w:spacing w:after="60" w:line="264" w:lineRule="auto"/>
+        <w:ind w:left="227"/>
+      </w:pPr>
+      <w:r>
+        <w:rPr>
+          <w:rFonts w:ascii="맑은 고딕" w:hAnsi="맑은 고딕" w:eastAsia="맑은 고딕"/>
+          <w:b w:val="0"/>
+          <w:color w:val="334155"/>
+          <w:sz w:val="21"/>
+        </w:rPr>
+        <w:t>데모 실측: npm run db:seed-pilot-kpi (Pilot 활성 + rollout 대리점)</w:t>
+      </w:r>
+    </w:p>
+    <w:p>
+      <w:pPr>
+        <w:spacing w:before="200" w:after="40"/>
+      </w:pPr>
+      <w:r>
+        <w:rPr>
+          <w:rFonts w:ascii="맑은 고딕" w:hAnsi="맑은 고딕" w:eastAsia="맑은 고딕"/>
+          <w:b/>
+          <w:color w:val="0F172A"/>
+          <w:sz w:val="21"/>
+        </w:rPr>
+        <w:t>■ 스크린샷 S-10: Pilot KPI 대시보드 스트립</w:t>
+      </w:r>
+    </w:p>
+    <w:p>
+      <w:pPr>
+        <w:spacing w:after="40" w:line="276" w:lineRule="auto"/>
+      </w:pPr>
+      <w:r>
+        <w:rPr>
+          <w:rFonts w:ascii="맑은 고딕" w:hAnsi="맑은 고딕" w:eastAsia="맑은 고딕"/>
+          <w:b w:val="0"/>
+          <w:color w:val="64748B"/>
+          <w:sz w:val="19"/>
+        </w:rPr>
+        <w:t>경로: /dashboard</w:t>
+      </w:r>
+    </w:p>
+    <w:p>
+      <w:pPr>
+        <w:spacing w:after="40" w:line="276" w:lineRule="auto"/>
+      </w:pPr>
+      <w:r>
+        <w:rPr>
+          <w:rFonts w:ascii="맑은 고딕" w:hAnsi="맑은 고딕" w:eastAsia="맑은 고딕"/>
+          <w:b w:val="0"/>
+          <w:color w:val="64748B"/>
+          <w:sz w:val="19"/>
+        </w:rPr>
+        <w:t>계정: admin@intranet.local</w:t>
+      </w:r>
+    </w:p>
+    <w:p>
+      <w:pPr>
+        <w:spacing w:after="40" w:line="276" w:lineRule="auto"/>
+      </w:pPr>
+      <w:r>
+        <w:rPr>
+          <w:rFonts w:ascii="맑은 고딕" w:hAnsi="맑은 고딕" w:eastAsia="맑은 고딕"/>
+          <w:b/>
+          <w:color w:val="0F172A"/>
+          <w:sz w:val="19"/>
+        </w:rPr>
+        <w:t>캡처 지시</w:t>
+      </w:r>
+    </w:p>
+    <w:p>
+      <w:pPr>
+        <w:spacing w:after="20" w:line="276" w:lineRule="auto"/>
+      </w:pPr>
+      <w:r>
+        <w:rPr>
+          <w:rFonts w:ascii="맑은 고딕" w:hAnsi="맑은 고딕" w:eastAsia="맑은 고딕"/>
+          <w:b w:val="0"/>
+          <w:color w:val="334155"/>
+          <w:sz w:val="19"/>
+        </w:rPr>
+        <w:t xml:space="preserve">  1. ADMIN 로그인 후 /dashboard — KPI strip 아래 Pilot KPI (7일) 카드 캡처</w:t>
+      </w:r>
+    </w:p>
+    <w:p>
+      <w:pPr>
+        <w:spacing w:after="20" w:line="276" w:lineRule="auto"/>
+      </w:pPr>
+      <w:r>
+        <w:rPr>
+          <w:rFonts w:ascii="맑은 고딕" w:hAnsi="맑은 고딕" w:eastAsia="맑은 고딕"/>
+          <w:b w:val="0"/>
+          <w:color w:val="334155"/>
+          <w:sz w:val="19"/>
+        </w:rPr>
+        <w:t xml:space="preserve">  2. 6개 KPI 타일(목표 배지·실측값·상태 색)이 모두 보이도록 스크롤</w:t>
+      </w:r>
+    </w:p>
+    <w:p>
+      <w:pPr>
+        <w:spacing w:after="20" w:line="276" w:lineRule="auto"/>
+      </w:pPr>
+      <w:r>
+        <w:rPr>
+          <w:rFonts w:ascii="맑은 고딕" w:hAnsi="맑은 고딕" w:eastAsia="맑은 고딕"/>
+          <w:b w:val="0"/>
+          <w:color w:val="334155"/>
+          <w:sz w:val="19"/>
+        </w:rPr>
+        <w:t xml:space="preserve">  3. 「상세 모니터링」 링크 포함</w:t>
+      </w:r>
+    </w:p>
+    <w:p>
+      <w:pPr>
+        <w:spacing w:after="20" w:line="276" w:lineRule="auto"/>
+      </w:pPr>
+      <w:r>
+        <w:rPr>
+          <w:rFonts w:ascii="맑은 고딕" w:hAnsi="맑은 고딕" w:eastAsia="맑은 고딕"/>
+          <w:b w:val="0"/>
+          <w:color w:val="334155"/>
+          <w:sz w:val="19"/>
+        </w:rPr>
+        <w:t xml:space="preserve">  4. 동일 화면 /admin/pilot → 모니터링 탭 2번째 캡처 권장</w:t>
+      </w:r>
+    </w:p>
+    <w:p>
+      <w:pPr>
+        <w:spacing w:after="80" w:line="276" w:lineRule="auto"/>
+      </w:pPr>
+      <w:r>
+        <w:rPr>
+          <w:rFonts w:ascii="맑은 고딕" w:hAnsi="맑은 고딕" w:eastAsia="맑은 고딕"/>
+          <w:b w:val="0"/>
+          <w:color w:val="64748B"/>
+          <w:sz w:val="18"/>
+        </w:rPr>
+        <w:t>비고: Pilot KPI seed 후 캡처하면 목표 대비 ok/warn 색상이 보임</w:t>
+      </w:r>
+    </w:p>
+    <w:p>
+      <w:pPr>
+        <w:spacing w:before="80" w:after="200"/>
+        <w:jc w:val="center"/>
+      </w:pPr>
+      <w:r>
+        <w:rPr>
+          <w:rFonts w:ascii="맑은 고딕" w:hAnsi="맑은 고딕" w:eastAsia="맑은 고딕"/>
+          <w:b/>
+          <w:color w:val="64748B"/>
+          <w:sz w:val="18"/>
+        </w:rPr>
+        <w:t>[ 이미지 삽입 영역 — S-10 ]</w:t>
         <w:br/>
         <w:t>권장: 1920×1080 또는 모바일 390×844 · PNG · 개인정보·데모 비밀번호 마스킹</w:t>
       </w:r>
@@ -6245,7 +6467,21 @@
           <w:color w:val="334155"/>
           <w:sz w:val="21"/>
         </w:rPr>
-        <w:t>배포 전: typecheck · lint · build · production:check · smoke · test:ui-upgrade</w:t>
+        <w:t>배포 전: typecheck · lint · build · production:check · smoke · test:e2e:docker</w:t>
+      </w:r>
+    </w:p>
+    <w:p>
+      <w:pPr>
+        <w:spacing w:after="160" w:line="276" w:lineRule="auto"/>
+      </w:pPr>
+      <w:r>
+        <w:rPr>
+          <w:rFonts w:ascii="맑은 고딕" w:hAnsi="맑은 고딕" w:eastAsia="맑은 고딕"/>
+          <w:b w:val="0"/>
+          <w:color w:val="334155"/>
+          <w:sz w:val="21"/>
+        </w:rPr>
+        <w:t>Pilot 데모: PILOT_MODE=true · RUN_DEMO_SEED=true → db:seed-pilot-kpi → S-10 캡처</w:t>
       </w:r>
     </w:p>
     <w:p>
@@ -6547,6 +6783,146 @@
                 <w:sz w:val="19"/>
               </w:rPr>
               <w:t>스크린샷 캡처 지시, 비즈니스 KPI, Risks &amp; Assumptions, Word 레이아웃·헤더/푸터, 변경 이력 섹션 추가. Frontend UX/UI Phase 1(Design System v5) 반영.</w:t>
+            </w:r>
+          </w:p>
+        </w:tc>
+      </w:tr>
+      <w:tr>
+        <w:tc>
+          <w:tcPr>
+            <w:tcW w:type="dxa" w:w="2296"/>
+          </w:tcPr>
+          <w:p>
+            <w:r/>
+            <w:r>
+              <w:rPr>
+                <w:rFonts w:ascii="맑은 고딕" w:hAnsi="맑은 고딕" w:eastAsia="맑은 고딕"/>
+                <w:b w:val="0"/>
+                <w:color w:val="334155"/>
+                <w:sz w:val="19"/>
+              </w:rPr>
+              <w:t>1.2.1 Final r2</w:t>
+            </w:r>
+          </w:p>
+        </w:tc>
+        <w:tc>
+          <w:tcPr>
+            <w:tcW w:type="dxa" w:w="2296"/>
+          </w:tcPr>
+          <w:p>
+            <w:r/>
+            <w:r>
+              <w:rPr>
+                <w:rFonts w:ascii="맑은 고딕" w:hAnsi="맑은 고딕" w:eastAsia="맑은 고딕"/>
+                <w:b w:val="0"/>
+                <w:color w:val="334155"/>
+                <w:sz w:val="19"/>
+              </w:rPr>
+              <w:t>2026-07-05</w:t>
+            </w:r>
+          </w:p>
+        </w:tc>
+        <w:tc>
+          <w:tcPr>
+            <w:tcW w:type="dxa" w:w="2296"/>
+          </w:tcPr>
+          <w:p>
+            <w:r/>
+            <w:r>
+              <w:rPr>
+                <w:rFonts w:ascii="맑은 고딕" w:hAnsi="맑은 고딕" w:eastAsia="맑은 고딕"/>
+                <w:b w:val="0"/>
+                <w:color w:val="334155"/>
+                <w:sz w:val="19"/>
+              </w:rPr>
+              <w:t>개정</w:t>
+            </w:r>
+          </w:p>
+        </w:tc>
+        <w:tc>
+          <w:tcPr>
+            <w:tcW w:type="dxa" w:w="2296"/>
+          </w:tcPr>
+          <w:p>
+            <w:r/>
+            <w:r>
+              <w:rPr>
+                <w:rFonts w:ascii="맑은 고딕" w:hAnsi="맑은 고딕" w:eastAsia="맑은 고딕"/>
+                <w:b w:val="0"/>
+                <w:color w:val="334155"/>
+                <w:sz w:val="19"/>
+              </w:rPr>
+              <w:t>제품 v1.3.1~1.3.3 — Frontend UX/UI Phase 2~4 반영. a11y·메일함 DnD·Page Builder 미저장·FormSteps·Pilot KPI·Sheet a11y. S-10 Pilot KPI 캡처 지시 추가.</w:t>
+            </w:r>
+          </w:p>
+        </w:tc>
+      </w:tr>
+      <w:tr>
+        <w:tc>
+          <w:tcPr>
+            <w:tcW w:type="dxa" w:w="2296"/>
+          </w:tcPr>
+          <w:p>
+            <w:r/>
+            <w:r>
+              <w:rPr>
+                <w:rFonts w:ascii="맑은 고딕" w:hAnsi="맑은 고딕" w:eastAsia="맑은 고딕"/>
+                <w:b w:val="0"/>
+                <w:color w:val="334155"/>
+                <w:sz w:val="19"/>
+              </w:rPr>
+              <w:t>1.2.1 Final r3</w:t>
+            </w:r>
+          </w:p>
+        </w:tc>
+        <w:tc>
+          <w:tcPr>
+            <w:tcW w:type="dxa" w:w="2296"/>
+          </w:tcPr>
+          <w:p>
+            <w:r/>
+            <w:r>
+              <w:rPr>
+                <w:rFonts w:ascii="맑은 고딕" w:hAnsi="맑은 고딕" w:eastAsia="맑은 고딕"/>
+                <w:b w:val="0"/>
+                <w:color w:val="334155"/>
+                <w:sz w:val="19"/>
+              </w:rPr>
+              <w:t>2026-07-05</w:t>
+            </w:r>
+          </w:p>
+        </w:tc>
+        <w:tc>
+          <w:tcPr>
+            <w:tcW w:type="dxa" w:w="2296"/>
+          </w:tcPr>
+          <w:p>
+            <w:r/>
+            <w:r>
+              <w:rPr>
+                <w:rFonts w:ascii="맑은 고딕" w:hAnsi="맑은 고딕" w:eastAsia="맑은 고딕"/>
+                <w:b w:val="0"/>
+                <w:color w:val="334155"/>
+                <w:sz w:val="19"/>
+              </w:rPr>
+              <w:t>운영</w:t>
+            </w:r>
+          </w:p>
+        </w:tc>
+        <w:tc>
+          <w:tcPr>
+            <w:tcW w:type="dxa" w:w="2296"/>
+          </w:tcPr>
+          <w:p>
+            <w:r/>
+            <w:r>
+              <w:rPr>
+                <w:rFonts w:ascii="맑은 고딕" w:hAnsi="맑은 고딕" w:eastAsia="맑은 고딕"/>
+                <w:b w:val="0"/>
+                <w:color w:val="334155"/>
+                <w:sz w:val="19"/>
+              </w:rPr>
+              <w:t>제품 v1.3.4 — Pilot KPI seed(db:seed-pilot-kpi), test:e2e:docker, PRD S-10 캡처 절차, HQ 체크리스트 갱신.</w:t>
             </w:r>
           </w:p>
         </w:tc>

</xml_diff>